<commit_message>
Deploying to gh-pages from @ d-morrison/pr.helpers@68bf65744e28f7a17e32dffd531f38d9d3a60f22 🚀
</commit_message>
<xml_diff>
--- a/vignettes/articles/quarto_article.docx
+++ b/vignettes/articles/quarto_article.docx
@@ -23,7 +23,7 @@
         <w:pStyle w:val="Date"/>
       </w:pPr>
       <w:r>
-        <w:t xml:space="preserve">2026-02-02</w:t>
+        <w:t xml:space="preserve">2026-04-21</w:t>
       </w:r>
     </w:p>
     <w:p>
@@ -43,7 +43,7 @@
         <w:t xml:space="preserve">(rpt)</w:t>
       </w:r>
     </w:p>
-    <w:bookmarkStart w:id="20" w:name="overview"/>
+    <w:bookmarkStart w:id="9" w:name="overview"/>
     <w:p>
       <w:pPr>
         <w:pStyle w:val="Heading2"/>
@@ -60,8 +60,8 @@
         <w:t xml:space="preserve">This article demonstrates advanced features of Quarto for package documentation. Unlike vignettes, articles are only available on the documentation website and are not included in the package bundle.</w:t>
       </w:r>
     </w:p>
-    <w:bookmarkEnd w:id="20"/>
-    <w:bookmarkStart w:id="21" w:name="when-to-use-articles-vs-vignettes"/>
+    <w:bookmarkEnd w:id="9"/>
+    <w:bookmarkStart w:id="10" w:name="when-to-use-articles-vs-vignettes"/>
     <w:p>
       <w:pPr>
         <w:pStyle w:val="Heading2"/>
@@ -190,8 +190,8 @@
         <w:t xml:space="preserve">Supplementary material</w:t>
       </w:r>
     </w:p>
-    <w:bookmarkEnd w:id="21"/>
-    <w:bookmarkStart w:id="45" w:name="advanced-quarto-features"/>
+    <w:bookmarkEnd w:id="10"/>
+    <w:bookmarkStart w:id="34" w:name="advanced-quarto-features"/>
     <w:p>
       <w:pPr>
         <w:pStyle w:val="Heading2"/>
@@ -200,7 +200,7 @@
         <w:t xml:space="preserve">3 Advanced Quarto Features</w:t>
       </w:r>
     </w:p>
-    <w:bookmarkStart w:id="26" w:name="cross-references"/>
+    <w:bookmarkStart w:id="15" w:name="cross-references"/>
     <w:p>
       <w:pPr>
         <w:pStyle w:val="Heading3"/>
@@ -779,7 +779,7 @@
       <w:tr>
         <w:tc>
           <w:tcPr/>
-          <w:bookmarkStart w:id="25" w:name="fig-scatter"/>
+          <w:bookmarkStart w:id="14" w:name="fig-scatter"/>
           <w:p>
             <w:pPr>
               <w:pStyle w:val="Compact"/>
@@ -790,18 +790,18 @@
                 <wp:inline>
                   <wp:extent cx="5334000" cy="3809999"/>
                   <wp:effectExtent b="0" l="0" r="0" t="0"/>
-                  <wp:docPr descr="" title="" id="23" name="Picture"/>
+                  <wp:docPr descr="" title="" id="12" name="Picture"/>
                   <a:graphic>
                     <a:graphicData uri="http://schemas.openxmlformats.org/drawingml/2006/picture">
                       <pic:pic>
                         <pic:nvPicPr>
-                          <pic:cNvPr descr="quarto_article_files/figure-docx/fig-scatter-1.png" id="24" name="Picture"/>
+                          <pic:cNvPr descr="quarto_article_files/figure-docx/fig-scatter-1.png" id="13" name="Picture"/>
                           <pic:cNvPicPr>
                             <a:picLocks noChangeArrowheads="1" noChangeAspect="1"/>
                           </pic:cNvPicPr>
                         </pic:nvPicPr>
                         <pic:blipFill>
-                          <a:blip r:embed="rId22"/>
+                          <a:blip r:embed="rId11"/>
                           <a:stretch>
                             <a:fillRect/>
                           </a:stretch>
@@ -841,12 +841,12 @@
               <w:t xml:space="preserve">Figure 1: Scatter plot demonstrating cross-referencing</w:t>
             </w:r>
           </w:p>
-          <w:bookmarkEnd w:id="25"/>
+          <w:bookmarkEnd w:id="14"/>
         </w:tc>
       </w:tr>
     </w:tbl>
-    <w:bookmarkEnd w:id="26"/>
-    <w:bookmarkStart w:id="28" w:name="summary-tables"/>
+    <w:bookmarkEnd w:id="15"/>
+    <w:bookmarkStart w:id="17" w:name="summary-tables"/>
     <w:p>
       <w:pPr>
         <w:pStyle w:val="Heading3"/>
@@ -1245,7 +1245,7 @@
       <w:tr>
         <w:tc>
           <w:tcPr/>
-          <w:bookmarkStart w:id="27" w:name="tbl-summary"/>
+          <w:bookmarkStart w:id="16" w:name="tbl-summary"/>
           <w:p>
             <w:pPr>
               <w:jc w:val="center"/>
@@ -1520,7 +1520,7 @@
               </w:tc>
             </w:tr>
           </w:tbl>
-          <w:bookmarkEnd w:id="27"/>
+          <w:bookmarkEnd w:id="16"/>
           <w:p/>
         </w:tc>
       </w:tr>
@@ -1547,8 +1547,8 @@
         <w:t xml:space="preserve">, the variables have similar distributions.</w:t>
       </w:r>
     </w:p>
-    <w:bookmarkEnd w:id="28"/>
-    <w:bookmarkStart w:id="29" w:name="code-folding"/>
+    <w:bookmarkEnd w:id="17"/>
+    <w:bookmarkStart w:id="18" w:name="code-folding"/>
     <w:p>
       <w:pPr>
         <w:pStyle w:val="Heading3"/>
@@ -2140,8 +2140,8 @@
         <w:t xml:space="preserve">#&gt; 2     B    98.13191  13.84514   53.261796  8.934998</w:t>
       </w:r>
     </w:p>
-    <w:bookmarkEnd w:id="29"/>
-    <w:bookmarkStart w:id="33" w:name="tabsets"/>
+    <w:bookmarkEnd w:id="18"/>
+    <w:bookmarkStart w:id="22" w:name="tabsets"/>
     <w:p>
       <w:pPr>
         <w:pStyle w:val="Heading3"/>
@@ -2167,18 +2167,18 @@
           <wp:inline>
             <wp:extent cx="5334000" cy="3809999"/>
             <wp:effectExtent b="0" l="0" r="0" t="0"/>
-            <wp:docPr descr="" title="" id="31" name="Picture"/>
+            <wp:docPr descr="" title="" id="20" name="Picture"/>
             <a:graphic>
               <a:graphicData uri="http://schemas.openxmlformats.org/drawingml/2006/picture">
                 <pic:pic>
                   <pic:nvPicPr>
-                    <pic:cNvPr descr="quarto_article_files/figure-docx/unnamed-chunk-3-1.png" id="32" name="Picture"/>
+                    <pic:cNvPr descr="quarto_article_files/figure-docx/unnamed-chunk-3-1.png" id="21" name="Picture"/>
                     <pic:cNvPicPr>
                       <a:picLocks noChangeArrowheads="1" noChangeAspect="1"/>
                     </pic:cNvPicPr>
                   </pic:nvPicPr>
                   <pic:blipFill>
-                    <a:blip r:embed="rId30"/>
+                    <a:blip r:embed="rId19"/>
                     <a:stretch>
                       <a:fillRect/>
                     </a:stretch>
@@ -2387,8 +2387,8 @@
         <w:t xml:space="preserve">#&gt; 10 10     A  99.18958 34.67098</w:t>
       </w:r>
     </w:p>
-    <w:bookmarkEnd w:id="33"/>
-    <w:bookmarkStart w:id="40" w:name="advanced-callouts"/>
+    <w:bookmarkEnd w:id="22"/>
+    <w:bookmarkStart w:id="29" w:name="advanced-callouts"/>
     <w:p>
       <w:pPr>
         <w:pStyle w:val="Heading3"/>
@@ -2438,18 +2438,18 @@
                 <wp:inline>
                   <wp:extent cx="152400" cy="152400"/>
                   <wp:effectExtent b="0" l="0" r="0" t="0"/>
-                  <wp:docPr descr="" title="" id="35" name="Picture"/>
+                  <wp:docPr descr="" title="" id="24" name="Picture"/>
                   <a:graphic>
                     <a:graphicData uri="http://schemas.openxmlformats.org/drawingml/2006/picture">
                       <pic:pic>
                         <pic:nvPicPr>
-                          <pic:cNvPr descr="/opt/quarto/share/formats/docx/important.png" id="36" name="Picture"/>
+                          <pic:cNvPr descr="/opt/quarto/share/formats/docx/important.png" id="25" name="Picture"/>
                           <pic:cNvPicPr>
                             <a:picLocks noChangeArrowheads="1" noChangeAspect="1"/>
                           </pic:cNvPicPr>
                         </pic:nvPicPr>
                         <pic:blipFill>
-                          <a:blip r:embed="rId34"/>
+                          <a:blip r:embed="rId23"/>
                           <a:stretch>
                             <a:fillRect/>
                           </a:stretch>
@@ -2598,18 +2598,18 @@
                 <wp:inline>
                   <wp:extent cx="152400" cy="152400"/>
                   <wp:effectExtent b="0" l="0" r="0" t="0"/>
-                  <wp:docPr descr="" title="" id="38" name="Picture"/>
+                  <wp:docPr descr="" title="" id="27" name="Picture"/>
                   <a:graphic>
                     <a:graphicData uri="http://schemas.openxmlformats.org/drawingml/2006/picture">
                       <pic:pic>
                         <pic:nvPicPr>
-                          <pic:cNvPr descr="/opt/quarto/share/formats/docx/warning.png" id="39" name="Picture"/>
+                          <pic:cNvPr descr="/opt/quarto/share/formats/docx/warning.png" id="28" name="Picture"/>
                           <pic:cNvPicPr>
                             <a:picLocks noChangeArrowheads="1" noChangeAspect="1"/>
                           </pic:cNvPicPr>
                         </pic:nvPicPr>
                         <pic:blipFill>
-                          <a:blip r:embed="rId37"/>
+                          <a:blip r:embed="rId26"/>
                           <a:stretch>
                             <a:fillRect/>
                           </a:stretch>
@@ -2673,8 +2673,8 @@
         </w:tc>
       </w:tr>
     </w:tbl>
-    <w:bookmarkEnd w:id="40"/>
-    <w:bookmarkStart w:id="44" w:name="columns-layout"/>
+    <w:bookmarkEnd w:id="29"/>
+    <w:bookmarkStart w:id="33" w:name="columns-layout"/>
     <w:p>
       <w:pPr>
         <w:pStyle w:val="Heading3"/>
@@ -2768,18 +2768,18 @@
           <wp:inline>
             <wp:extent cx="5334000" cy="3809999"/>
             <wp:effectExtent b="0" l="0" r="0" t="0"/>
-            <wp:docPr descr="" title="" id="42" name="Picture"/>
+            <wp:docPr descr="" title="" id="31" name="Picture"/>
             <a:graphic>
               <a:graphicData uri="http://schemas.openxmlformats.org/drawingml/2006/picture">
                 <pic:pic>
                   <pic:nvPicPr>
-                    <pic:cNvPr descr="quarto_article_files/figure-docx/unnamed-chunk-6-1.png" id="43" name="Picture"/>
+                    <pic:cNvPr descr="quarto_article_files/figure-docx/unnamed-chunk-6-1.png" id="32" name="Picture"/>
                     <pic:cNvPicPr>
                       <a:picLocks noChangeArrowheads="1" noChangeAspect="1"/>
                     </pic:cNvPicPr>
                   </pic:nvPicPr>
                   <pic:blipFill>
-                    <a:blip r:embed="rId41"/>
+                    <a:blip r:embed="rId30"/>
                     <a:stretch>
                       <a:fillRect/>
                     </a:stretch>
@@ -2806,9 +2806,9 @@
         </w:drawing>
       </w:r>
     </w:p>
-    <w:bookmarkEnd w:id="44"/>
-    <w:bookmarkEnd w:id="45"/>
-    <w:bookmarkStart w:id="46" w:name="working-with-package-functions"/>
+    <w:bookmarkEnd w:id="33"/>
+    <w:bookmarkEnd w:id="34"/>
+    <w:bookmarkStart w:id="35" w:name="working-with-package-functions"/>
     <w:p>
       <w:pPr>
         <w:pStyle w:val="Heading2"/>
@@ -3061,8 +3061,8 @@
         <w:t xml:space="preserve">#&gt; [1] 47.42519</w:t>
       </w:r>
     </w:p>
-    <w:bookmarkEnd w:id="46"/>
-    <w:bookmarkStart w:id="48" w:name="code-annotations"/>
+    <w:bookmarkEnd w:id="35"/>
+    <w:bookmarkStart w:id="37" w:name="code-annotations"/>
     <w:p>
       <w:pPr>
         <w:pStyle w:val="Heading2"/>
@@ -3079,7 +3079,7 @@
         <w:t xml:space="preserve">Quarto supports code annotations for detailed explanations:</w:t>
       </w:r>
     </w:p>
-    <w:bookmarkStart w:id="47" w:name="annotated-cell-6"/>
+    <w:bookmarkStart w:id="36" w:name="annotated-cell-6"/>
     <w:p>
       <w:pPr>
         <w:pStyle w:val="SourceCode"/>
@@ -3235,7 +3235,7 @@
         <w:t xml:space="preserve">#&gt; [1] 3</w:t>
       </w:r>
     </w:p>
-    <w:bookmarkEnd w:id="47"/>
+    <w:bookmarkEnd w:id="36"/>
     <w:p>
       <w:pPr>
         <w:pStyle w:val="DefinitionTerm"/>
@@ -3300,8 +3300,8 @@
         <w:t xml:space="preserve">Display the results</w:t>
       </w:r>
     </w:p>
-    <w:bookmarkEnd w:id="48"/>
-    <w:bookmarkStart w:id="49" w:name="mathematical-notation"/>
+    <w:bookmarkEnd w:id="37"/>
+    <w:bookmarkStart w:id="38" w:name="mathematical-notation"/>
     <w:p>
       <w:pPr>
         <w:pStyle w:val="Heading2"/>
@@ -3508,8 +3508,8 @@
         </m:oMath>
       </m:oMathPara>
     </w:p>
-    <w:bookmarkEnd w:id="49"/>
-    <w:bookmarkStart w:id="53" w:name="tips-and-best-practices"/>
+    <w:bookmarkEnd w:id="38"/>
+    <w:bookmarkStart w:id="42" w:name="tips-and-best-practices"/>
     <w:p>
       <w:pPr>
         <w:pStyle w:val="Heading2"/>
@@ -3559,18 +3559,18 @@
                 <wp:inline>
                   <wp:extent cx="152400" cy="152400"/>
                   <wp:effectExtent b="0" l="0" r="0" t="0"/>
-                  <wp:docPr descr="" title="" id="51" name="Picture"/>
+                  <wp:docPr descr="" title="" id="40" name="Picture"/>
                   <a:graphic>
                     <a:graphicData uri="http://schemas.openxmlformats.org/drawingml/2006/picture">
                       <pic:pic>
                         <pic:nvPicPr>
-                          <pic:cNvPr descr="/opt/quarto/share/formats/docx/tip.png" id="52" name="Picture"/>
+                          <pic:cNvPr descr="/opt/quarto/share/formats/docx/tip.png" id="41" name="Picture"/>
                           <pic:cNvPicPr>
                             <a:picLocks noChangeArrowheads="1" noChangeAspect="1"/>
                           </pic:cNvPicPr>
                         </pic:nvPicPr>
                         <pic:blipFill>
-                          <a:blip r:embed="rId50"/>
+                          <a:blip r:embed="rId39"/>
                           <a:stretch>
                             <a:fillRect/>
                           </a:stretch>
@@ -3694,8 +3694,8 @@
         </w:tc>
       </w:tr>
     </w:tbl>
-    <w:bookmarkEnd w:id="53"/>
-    <w:bookmarkStart w:id="54" w:name="conclusion"/>
+    <w:bookmarkEnd w:id="42"/>
+    <w:bookmarkStart w:id="43" w:name="conclusion"/>
     <w:p>
       <w:pPr>
         <w:pStyle w:val="Heading2"/>
@@ -3712,8 +3712,8 @@
         <w:t xml:space="preserve">This article demonstrates the advanced capabilities of Quarto for creating rich, interactive documentation for R packages.</w:t>
       </w:r>
     </w:p>
-    <w:bookmarkEnd w:id="54"/>
-    <w:bookmarkStart w:id="58" w:name="learn-more"/>
+    <w:bookmarkEnd w:id="43"/>
+    <w:bookmarkStart w:id="47" w:name="learn-more"/>
     <w:p>
       <w:pPr>
         <w:pStyle w:val="Heading2"/>
@@ -3736,7 +3736,7 @@
       <w:r>
         <w:t xml:space="preserve"> </w:t>
       </w:r>
-      <w:hyperlink r:id="rId55">
+      <w:hyperlink r:id="rId44">
         <w:r>
           <w:rPr>
             <w:rStyle w:val="Hyperlink"/>
@@ -3759,7 +3759,7 @@
       <w:r>
         <w:t xml:space="preserve"> </w:t>
       </w:r>
-      <w:hyperlink r:id="rId56">
+      <w:hyperlink r:id="rId45">
         <w:r>
           <w:rPr>
             <w:rStyle w:val="Hyperlink"/>
@@ -3782,7 +3782,7 @@
       <w:r>
         <w:t xml:space="preserve"> </w:t>
       </w:r>
-      <w:hyperlink r:id="rId57">
+      <w:hyperlink r:id="rId46">
         <w:r>
           <w:rPr>
             <w:rStyle w:val="Hyperlink"/>
@@ -3791,8 +3791,8 @@
         </w:r>
       </w:hyperlink>
     </w:p>
-    <w:bookmarkEnd w:id="58"/>
-    <w:bookmarkStart w:id="60" w:name="references"/>
+    <w:bookmarkEnd w:id="47"/>
+    <w:bookmarkStart w:id="49" w:name="references"/>
     <w:p>
       <w:pPr>
         <w:pStyle w:val="Heading2"/>
@@ -3801,9 +3801,9 @@
         <w:t xml:space="preserve">10 References</w:t>
       </w:r>
     </w:p>
-    <w:bookmarkStart w:id="59" w:name="refs"/>
-    <w:bookmarkEnd w:id="59"/>
-    <w:bookmarkEnd w:id="60"/>
+    <w:bookmarkStart w:id="48" w:name="refs"/>
+    <w:bookmarkEnd w:id="48"/>
+    <w:bookmarkEnd w:id="49"/>
     <w:sectPr>
       <w:footnotePr>
         <w:numRestart w:val="eachSect"/>
@@ -4185,10 +4185,10 @@
   <w:docDefaults>
     <w:rPrDefault>
       <w:rPr>
-        <w:rFonts w:asciiTheme="minorHAnsi" w:cstheme="minorBidi" w:eastAsiaTheme="minorHAnsi" w:hAnsiTheme="minorHAnsi"/>
+        <w:rFonts w:asciiTheme="minorHAnsi" w:cstheme="minorBidi" w:eastAsiaTheme="minorEastAsia" w:hAnsiTheme="minorHAnsi"/>
         <w:sz w:val="24"/>
         <w:szCs w:val="24"/>
-        <w:lang w:bidi="ar-SA" w:eastAsia="en-US" w:val="en-US"/>
+        <w:lang w:bidi="ar-SA" w:eastAsia="zh-CN" w:val="en-US"/>
       </w:rPr>
     </w:rPrDefault>
     <w:pPrDefault>
@@ -4729,13 +4729,6 @@
       </w:tblCellMar>
     </w:tblPr>
     <w:tblStylePr w:type="firstRow">
-      <w:tblPr>
-        <w:jc w:val="left"/>
-        <w:tblInd w:type="dxa" w:w="0"/>
-      </w:tblPr>
-      <w:trPr>
-        <w:jc w:val="left"/>
-      </w:trPr>
       <w:tcPr>
         <w:tcBorders>
           <w:bottom w:val="single"/>

</xml_diff>

<commit_message>
Deploying to gh-pages from @ d-morrison/pr.helpers@bcb24a5aeabb76e88745dfa4d4479966d9e1d9fb 🚀
</commit_message>
<xml_diff>
--- a/vignettes/articles/quarto_article.docx
+++ b/vignettes/articles/quarto_article.docx
@@ -23,7 +23,7 @@
         <w:pStyle w:val="Date"/>
       </w:pPr>
       <w:r>
-        <w:t xml:space="preserve">2026-04-21</w:t>
+        <w:t xml:space="preserve">2026-04-23</w:t>
       </w:r>
     </w:p>
     <w:p>
@@ -40,7 +40,7 @@
         <w:rPr>
           <w:rStyle w:val="NormalTok"/>
         </w:rPr>
-        <w:t xml:space="preserve">(rpt)</w:t>
+        <w:t xml:space="preserve">(pr.helpers)</w:t>
       </w:r>
     </w:p>
     <w:bookmarkStart w:id="9" w:name="overview"/>

</xml_diff>